<commit_message>
docs: start to add use cases to use case spec
</commit_message>
<xml_diff>
--- a/Documentation/Use_Case_Specification.docx
+++ b/Documentation/Use_Case_Specification.docx
@@ -2,41 +2,578 @@
 <file path=word/document.xml><?xml version="1.0" encoding="utf-8"?>
 <w:document xmlns:wpc="http://schemas.microsoft.com/office/word/2010/wordprocessingCanvas" xmlns:cx="http://schemas.microsoft.com/office/drawing/2014/chartex" xmlns:cx1="http://schemas.microsoft.com/office/drawing/2015/9/8/chartex" xmlns:cx2="http://schemas.microsoft.com/office/drawing/2015/10/21/chartex" xmlns:cx3="http://schemas.microsoft.com/office/drawing/2016/5/9/chartex" xmlns:cx4="http://schemas.microsoft.com/office/drawing/2016/5/10/chartex" xmlns:cx5="http://schemas.microsoft.com/office/drawing/2016/5/11/chartex" xmlns:cx6="http://schemas.microsoft.com/office/drawing/2016/5/12/chartex" xmlns:cx7="http://schemas.microsoft.com/office/drawing/2016/5/13/chartex" xmlns:cx8="http://schemas.microsoft.com/office/drawing/2016/5/14/chartex" xmlns:mc="http://schemas.openxmlformats.org/markup-compatibility/2006" xmlns:aink="http://schemas.microsoft.com/office/drawing/2016/ink" xmlns:am3d="http://schemas.microsoft.com/office/drawing/2017/model3d" xmlns:o="urn:schemas-microsoft-com:office:office" xmlns:oel="http://schemas.microsoft.com/office/2019/extlst" xmlns:r="http://schemas.openxmlformats.org/officeDocument/2006/relationships" xmlns:m="http://schemas.openxmlformats.org/officeDocument/2006/math" xmlns:v="urn:schemas-microsoft-com:vml" xmlns:wp14="http://schemas.microsoft.com/office/word/2010/wordprocessingDrawing" xmlns:wp="http://schemas.openxmlformats.org/drawingml/2006/wordprocessingDrawing" xmlns:w10="urn:schemas-microsoft-com:office:word" xmlns:w="http://schemas.openxmlformats.org/wordprocessingml/2006/main" xmlns:w14="http://schemas.microsoft.com/office/word/2010/wordml" xmlns:w15="http://schemas.microsoft.com/office/word/2012/wordml" xmlns:w16cex="http://schemas.microsoft.com/office/word/2018/wordml/cex" xmlns:w16cid="http://schemas.microsoft.com/office/word/2016/wordml/cid" xmlns:w16="http://schemas.microsoft.com/office/word/2018/wordml" xmlns:w16du="http://schemas.microsoft.com/office/word/2023/wordml/word16du" xmlns:w16sdtdh="http://schemas.microsoft.com/office/word/2020/wordml/sdtdatahash" xmlns:w16sdtfl="http://schemas.microsoft.com/office/word/2024/wordml/sdtformatlock" xmlns:w16se="http://schemas.microsoft.com/office/word/2015/wordml/symex" xmlns:wpg="http://schemas.microsoft.com/office/word/2010/wordprocessingGroup" xmlns:wpi="http://schemas.microsoft.com/office/word/2010/wordprocessingInk" xmlns:wne="http://schemas.microsoft.com/office/word/2006/wordml" xmlns:wps="http://schemas.microsoft.com/office/word/2010/wordprocessingShape" mc:Ignorable="w14 w15 w16se w16cid w16 w16cex w16sdtdh w16sdtfl w16du wp14">
   <w:body>
+    <w:tbl>
+      <w:tblPr>
+        <w:tblStyle w:val="TableGrid"/>
+        <w:tblW w:w="0" w:type="auto"/>
+        <w:tblLook w:val="04A0" w:firstRow="1" w:lastRow="0" w:firstColumn="1" w:lastColumn="0" w:noHBand="0" w:noVBand="1"/>
+      </w:tblPr>
+      <w:tblGrid>
+        <w:gridCol w:w="4508"/>
+        <w:gridCol w:w="4508"/>
+      </w:tblGrid>
+      <w:tr>
+        <w:tc>
+          <w:tcPr>
+            <w:tcW w:w="4508" w:type="dxa"/>
+          </w:tcPr>
+          <w:p>
+            <w:r>
+              <w:rPr>
+                <w:b/>
+                <w:bCs/>
+              </w:rPr>
+              <w:t xml:space="preserve">Use Case ID: </w:t>
+            </w:r>
+          </w:p>
+        </w:tc>
+        <w:tc>
+          <w:tcPr>
+            <w:tcW w:w="4508" w:type="dxa"/>
+          </w:tcPr>
+          <w:p>
+            <w:r>
+              <w:rPr>
+                <w:b/>
+                <w:bCs/>
+              </w:rPr>
+              <w:t xml:space="preserve">Use Case: </w:t>
+            </w:r>
+            <w:r>
+              <w:t>Template</w:t>
+            </w:r>
+          </w:p>
+        </w:tc>
+      </w:tr>
+      <w:tr>
+        <w:tc>
+          <w:tcPr>
+            <w:tcW w:w="9016" w:type="dxa"/>
+            <w:gridSpan w:val="2"/>
+          </w:tcPr>
+          <w:p>
+            <w:pPr>
+              <w:rPr>
+                <w:b/>
+                <w:bCs/>
+              </w:rPr>
+            </w:pPr>
+            <w:r>
+              <w:rPr>
+                <w:b/>
+                <w:bCs/>
+              </w:rPr>
+              <w:t xml:space="preserve">Brief Description: </w:t>
+            </w:r>
+          </w:p>
+        </w:tc>
+      </w:tr>
+      <w:tr>
+        <w:tc>
+          <w:tcPr>
+            <w:tcW w:w="9016" w:type="dxa"/>
+            <w:gridSpan w:val="2"/>
+          </w:tcPr>
+          <w:p>
+            <w:pPr>
+              <w:rPr>
+                <w:b/>
+                <w:bCs/>
+              </w:rPr>
+            </w:pPr>
+            <w:r>
+              <w:rPr>
+                <w:b/>
+                <w:bCs/>
+              </w:rPr>
+              <w:t xml:space="preserve">Primary Actors: </w:t>
+            </w:r>
+          </w:p>
+        </w:tc>
+      </w:tr>
+      <w:tr>
+        <w:tc>
+          <w:tcPr>
+            <w:tcW w:w="9016" w:type="dxa"/>
+            <w:gridSpan w:val="2"/>
+          </w:tcPr>
+          <w:p>
+            <w:pPr>
+              <w:rPr>
+                <w:b/>
+                <w:bCs/>
+              </w:rPr>
+            </w:pPr>
+            <w:r>
+              <w:rPr>
+                <w:b/>
+                <w:bCs/>
+              </w:rPr>
+              <w:t xml:space="preserve">Secondary Actors: </w:t>
+            </w:r>
+          </w:p>
+        </w:tc>
+      </w:tr>
+      <w:tr>
+        <w:tc>
+          <w:tcPr>
+            <w:tcW w:w="9016" w:type="dxa"/>
+            <w:gridSpan w:val="2"/>
+          </w:tcPr>
+          <w:p>
+            <w:pPr>
+              <w:rPr>
+                <w:b/>
+                <w:bCs/>
+              </w:rPr>
+            </w:pPr>
+            <w:r>
+              <w:rPr>
+                <w:b/>
+                <w:bCs/>
+              </w:rPr>
+              <w:t xml:space="preserve">Preconditions: </w:t>
+            </w:r>
+          </w:p>
+        </w:tc>
+      </w:tr>
+      <w:tr>
+        <w:tc>
+          <w:tcPr>
+            <w:tcW w:w="9016" w:type="dxa"/>
+            <w:gridSpan w:val="2"/>
+          </w:tcPr>
+          <w:p>
+            <w:pPr>
+              <w:rPr>
+                <w:b/>
+                <w:bCs/>
+              </w:rPr>
+            </w:pPr>
+            <w:r>
+              <w:rPr>
+                <w:b/>
+                <w:bCs/>
+              </w:rPr>
+              <w:t>Main Flow: Not required</w:t>
+            </w:r>
+          </w:p>
+        </w:tc>
+      </w:tr>
+      <w:tr>
+        <w:tc>
+          <w:tcPr>
+            <w:tcW w:w="9016" w:type="dxa"/>
+            <w:gridSpan w:val="2"/>
+          </w:tcPr>
+          <w:p>
+            <w:pPr>
+              <w:rPr>
+                <w:b/>
+                <w:bCs/>
+              </w:rPr>
+            </w:pPr>
+            <w:r>
+              <w:rPr>
+                <w:b/>
+                <w:bCs/>
+              </w:rPr>
+              <w:t xml:space="preserve">Extensions: </w:t>
+            </w:r>
+          </w:p>
+        </w:tc>
+      </w:tr>
+      <w:tr>
+        <w:tc>
+          <w:tcPr>
+            <w:tcW w:w="9016" w:type="dxa"/>
+            <w:gridSpan w:val="2"/>
+          </w:tcPr>
+          <w:p>
+            <w:pPr>
+              <w:rPr>
+                <w:b/>
+                <w:bCs/>
+              </w:rPr>
+            </w:pPr>
+            <w:r>
+              <w:rPr>
+                <w:b/>
+                <w:bCs/>
+              </w:rPr>
+              <w:t xml:space="preserve">Inclusions: </w:t>
+            </w:r>
+          </w:p>
+        </w:tc>
+      </w:tr>
+      <w:tr>
+        <w:tc>
+          <w:tcPr>
+            <w:tcW w:w="9016" w:type="dxa"/>
+            <w:gridSpan w:val="2"/>
+          </w:tcPr>
+          <w:p>
+            <w:pPr>
+              <w:rPr>
+                <w:b/>
+                <w:bCs/>
+              </w:rPr>
+            </w:pPr>
+            <w:r>
+              <w:rPr>
+                <w:b/>
+                <w:bCs/>
+              </w:rPr>
+              <w:t xml:space="preserve">Postconditions: </w:t>
+            </w:r>
+          </w:p>
+        </w:tc>
+      </w:tr>
+      <w:tr>
+        <w:tc>
+          <w:tcPr>
+            <w:tcW w:w="9016" w:type="dxa"/>
+            <w:gridSpan w:val="2"/>
+          </w:tcPr>
+          <w:p>
+            <w:r>
+              <w:rPr>
+                <w:b/>
+                <w:bCs/>
+              </w:rPr>
+              <w:t xml:space="preserve">Alternative Flows: </w:t>
+            </w:r>
+          </w:p>
+        </w:tc>
+      </w:tr>
+    </w:tbl>
     <w:p/>
-    <w:p/>
-    <w:p/>
-    <w:p/>
-    <w:p/>
-    <w:p/>
-    <w:p/>
-    <w:p/>
-    <w:p/>
-    <w:p/>
-    <w:p/>
-    <w:p/>
-    <w:p/>
-    <w:p/>
-    <w:p/>
-    <w:p/>
-    <w:p/>
-    <w:p/>
-    <w:p/>
-    <w:p/>
-    <w:p/>
-    <w:p/>
-    <w:p/>
-    <w:p/>
-    <w:p/>
-    <w:p/>
-    <w:p/>
-    <w:p/>
-    <w:p/>
-    <w:p/>
-    <w:p/>
-    <w:p/>
-    <w:p/>
-    <w:p/>
-    <w:p/>
+    <w:tbl>
+      <w:tblPr>
+        <w:tblStyle w:val="TableGrid"/>
+        <w:tblW w:w="0" w:type="auto"/>
+        <w:tblLook w:val="04A0" w:firstRow="1" w:lastRow="0" w:firstColumn="1" w:lastColumn="0" w:noHBand="0" w:noVBand="1"/>
+      </w:tblPr>
+      <w:tblGrid>
+        <w:gridCol w:w="4508"/>
+        <w:gridCol w:w="4508"/>
+      </w:tblGrid>
+      <w:tr>
+        <w:tc>
+          <w:tcPr>
+            <w:tcW w:w="4508" w:type="dxa"/>
+          </w:tcPr>
+          <w:p>
+            <w:r>
+              <w:rPr>
+                <w:b/>
+                <w:bCs/>
+              </w:rPr>
+              <w:t xml:space="preserve">Use Case ID: </w:t>
+            </w:r>
+            <w:r>
+              <w:t>1</w:t>
+            </w:r>
+          </w:p>
+        </w:tc>
+        <w:tc>
+          <w:tcPr>
+            <w:tcW w:w="4508" w:type="dxa"/>
+          </w:tcPr>
+          <w:p>
+            <w:r>
+              <w:rPr>
+                <w:b/>
+                <w:bCs/>
+              </w:rPr>
+              <w:t xml:space="preserve">Use Case: </w:t>
+            </w:r>
+            <w:r>
+              <w:t>Register</w:t>
+            </w:r>
+          </w:p>
+        </w:tc>
+      </w:tr>
+      <w:tr>
+        <w:tc>
+          <w:tcPr>
+            <w:tcW w:w="9016" w:type="dxa"/>
+            <w:gridSpan w:val="2"/>
+          </w:tcPr>
+          <w:p>
+            <w:r>
+              <w:rPr>
+                <w:b/>
+                <w:bCs/>
+              </w:rPr>
+              <w:t xml:space="preserve">Brief Description: </w:t>
+            </w:r>
+            <w:r>
+              <w:t>This use case defines how a user can register themselves as either a “commercial” or “non-commercial” customer. Successful registration permits the customer to login using their registered email and a randomly generated password.</w:t>
+            </w:r>
+          </w:p>
+        </w:tc>
+      </w:tr>
+      <w:tr>
+        <w:tc>
+          <w:tcPr>
+            <w:tcW w:w="9016" w:type="dxa"/>
+            <w:gridSpan w:val="2"/>
+          </w:tcPr>
+          <w:p>
+            <w:r>
+              <w:rPr>
+                <w:b/>
+                <w:bCs/>
+              </w:rPr>
+              <w:t xml:space="preserve">Primary Actors: </w:t>
+            </w:r>
+            <w:r>
+              <w:t>Customer</w:t>
+            </w:r>
+          </w:p>
+        </w:tc>
+      </w:tr>
+      <w:tr>
+        <w:tc>
+          <w:tcPr>
+            <w:tcW w:w="9016" w:type="dxa"/>
+            <w:gridSpan w:val="2"/>
+          </w:tcPr>
+          <w:p>
+            <w:r>
+              <w:rPr>
+                <w:b/>
+                <w:bCs/>
+              </w:rPr>
+              <w:t xml:space="preserve">Secondary Actors: </w:t>
+            </w:r>
+            <w:r>
+              <w:t>None</w:t>
+            </w:r>
+          </w:p>
+        </w:tc>
+      </w:tr>
+      <w:tr>
+        <w:tc>
+          <w:tcPr>
+            <w:tcW w:w="9016" w:type="dxa"/>
+            <w:gridSpan w:val="2"/>
+          </w:tcPr>
+          <w:p>
+            <w:r>
+              <w:rPr>
+                <w:b/>
+                <w:bCs/>
+              </w:rPr>
+              <w:t xml:space="preserve">Preconditions: </w:t>
+            </w:r>
+          </w:p>
+          <w:p>
+            <w:pPr>
+              <w:pStyle w:val="ListParagraph"/>
+              <w:numPr>
+                <w:ilvl w:val="0"/>
+                <w:numId w:val="1"/>
+              </w:numPr>
+            </w:pPr>
+            <w:r>
+              <w:t>The system is operational</w:t>
+            </w:r>
+          </w:p>
+          <w:p>
+            <w:pPr>
+              <w:pStyle w:val="ListParagraph"/>
+              <w:numPr>
+                <w:ilvl w:val="0"/>
+                <w:numId w:val="1"/>
+              </w:numPr>
+            </w:pPr>
+            <w:r>
+              <w:t>A commercial customer must register with the following details: company registration number, company directors, type of business, address, email address, etc.</w:t>
+            </w:r>
+          </w:p>
+          <w:p>
+            <w:pPr>
+              <w:pStyle w:val="ListParagraph"/>
+              <w:numPr>
+                <w:ilvl w:val="0"/>
+                <w:numId w:val="1"/>
+              </w:numPr>
+            </w:pPr>
+            <w:r>
+              <w:t>A non-commercial customer requires a valid email address.</w:t>
+            </w:r>
+          </w:p>
+        </w:tc>
+      </w:tr>
+      <w:tr>
+        <w:tc>
+          <w:tcPr>
+            <w:tcW w:w="9016" w:type="dxa"/>
+            <w:gridSpan w:val="2"/>
+          </w:tcPr>
+          <w:p>
+            <w:pPr>
+              <w:rPr>
+                <w:b/>
+                <w:bCs/>
+              </w:rPr>
+            </w:pPr>
+            <w:r>
+              <w:rPr>
+                <w:b/>
+                <w:bCs/>
+              </w:rPr>
+              <w:t>Main Flow: Not required</w:t>
+            </w:r>
+          </w:p>
+        </w:tc>
+      </w:tr>
+      <w:tr>
+        <w:tc>
+          <w:tcPr>
+            <w:tcW w:w="9016" w:type="dxa"/>
+            <w:gridSpan w:val="2"/>
+          </w:tcPr>
+          <w:p>
+            <w:r>
+              <w:rPr>
+                <w:b/>
+                <w:bCs/>
+              </w:rPr>
+              <w:t xml:space="preserve">Extensions: </w:t>
+            </w:r>
+          </w:p>
+          <w:p>
+            <w:pPr>
+              <w:pStyle w:val="ListParagraph"/>
+              <w:numPr>
+                <w:ilvl w:val="0"/>
+                <w:numId w:val="2"/>
+              </w:numPr>
+            </w:pPr>
+            <w:r>
+              <w:t>Validate</w:t>
+            </w:r>
+          </w:p>
+          <w:p>
+            <w:pPr>
+              <w:pStyle w:val="ListParagraph"/>
+              <w:numPr>
+                <w:ilvl w:val="0"/>
+                <w:numId w:val="2"/>
+              </w:numPr>
+            </w:pPr>
+            <w:r>
+              <w:t>SMTP_Notification</w:t>
+            </w:r>
+          </w:p>
+        </w:tc>
+      </w:tr>
+      <w:tr>
+        <w:tc>
+          <w:tcPr>
+            <w:tcW w:w="9016" w:type="dxa"/>
+            <w:gridSpan w:val="2"/>
+          </w:tcPr>
+          <w:p>
+            <w:r>
+              <w:rPr>
+                <w:b/>
+                <w:bCs/>
+              </w:rPr>
+              <w:t xml:space="preserve">Inclusions: </w:t>
+            </w:r>
+            <w:r>
+              <w:t>None</w:t>
+            </w:r>
+          </w:p>
+        </w:tc>
+      </w:tr>
+      <w:tr>
+        <w:tc>
+          <w:tcPr>
+            <w:tcW w:w="9016" w:type="dxa"/>
+            <w:gridSpan w:val="2"/>
+          </w:tcPr>
+          <w:p>
+            <w:r>
+              <w:rPr>
+                <w:b/>
+                <w:bCs/>
+              </w:rPr>
+              <w:t xml:space="preserve">Postconditions: </w:t>
+            </w:r>
+          </w:p>
+          <w:p>
+            <w:pPr>
+              <w:pStyle w:val="ListParagraph"/>
+              <w:numPr>
+                <w:ilvl w:val="0"/>
+                <w:numId w:val="3"/>
+              </w:numPr>
+            </w:pPr>
+            <w:r>
+              <w:t>Customer login account created</w:t>
+            </w:r>
+          </w:p>
+          <w:p>
+            <w:pPr>
+              <w:pStyle w:val="ListParagraph"/>
+              <w:numPr>
+                <w:ilvl w:val="0"/>
+                <w:numId w:val="3"/>
+              </w:numPr>
+            </w:pPr>
+            <w:r>
+              <w:t>A password is generated randomly required for login</w:t>
+            </w:r>
+          </w:p>
+          <w:p>
+            <w:pPr>
+              <w:pStyle w:val="ListParagraph"/>
+              <w:numPr>
+                <w:ilvl w:val="0"/>
+                <w:numId w:val="3"/>
+              </w:numPr>
+            </w:pPr>
+            <w:r>
+              <w:t>Customers are notified by an email in which their login details are included.</w:t>
+            </w:r>
+          </w:p>
+          <w:p>
+            <w:pPr>
+              <w:pStyle w:val="ListParagraph"/>
+              <w:numPr>
+                <w:ilvl w:val="0"/>
+                <w:numId w:val="3"/>
+              </w:numPr>
+            </w:pPr>
+            <w:r>
+              <w:t xml:space="preserve">Customers are required to change the initial password after first login. </w:t>
+            </w:r>
+          </w:p>
+        </w:tc>
+      </w:tr>
+      <w:tr>
+        <w:tc>
+          <w:tcPr>
+            <w:tcW w:w="9016" w:type="dxa"/>
+            <w:gridSpan w:val="2"/>
+          </w:tcPr>
+          <w:p>
+            <w:r>
+              <w:rPr>
+                <w:b/>
+                <w:bCs/>
+              </w:rPr>
+              <w:t xml:space="preserve">Alternative Flows: </w:t>
+            </w:r>
+          </w:p>
+        </w:tc>
+      </w:tr>
+    </w:tbl>
     <w:p/>
     <w:sectPr>
       <w:pgSz w:w="11906" w:h="16838"/>
@@ -96,6 +633,278 @@
     </w:p>
   </w:footnote>
 </w:footnotes>
+</file>
+
+<file path=word/numbering.xml><?xml version="1.0" encoding="utf-8"?>
+<w:numbering xmlns:wpc="http://schemas.microsoft.com/office/word/2010/wordprocessingCanvas" xmlns:cx="http://schemas.microsoft.com/office/drawing/2014/chartex" xmlns:cx1="http://schemas.microsoft.com/office/drawing/2015/9/8/chartex" xmlns:cx2="http://schemas.microsoft.com/office/drawing/2015/10/21/chartex" xmlns:cx3="http://schemas.microsoft.com/office/drawing/2016/5/9/chartex" xmlns:cx4="http://schemas.microsoft.com/office/drawing/2016/5/10/chartex" xmlns:cx5="http://schemas.microsoft.com/office/drawing/2016/5/11/chartex" xmlns:cx6="http://schemas.microsoft.com/office/drawing/2016/5/12/chartex" xmlns:cx7="http://schemas.microsoft.com/office/drawing/2016/5/13/chartex" xmlns:cx8="http://schemas.microsoft.com/office/drawing/2016/5/14/chartex" xmlns:mc="http://schemas.openxmlformats.org/markup-compatibility/2006" xmlns:aink="http://schemas.microsoft.com/office/drawing/2016/ink" xmlns:am3d="http://schemas.microsoft.com/office/drawing/2017/model3d" xmlns:o="urn:schemas-microsoft-com:office:office" xmlns:oel="http://schemas.microsoft.com/office/2019/extlst" xmlns:r="http://schemas.openxmlformats.org/officeDocument/2006/relationships" xmlns:m="http://schemas.openxmlformats.org/officeDocument/2006/math" xmlns:v="urn:schemas-microsoft-com:vml" xmlns:wp14="http://schemas.microsoft.com/office/word/2010/wordprocessingDrawing" xmlns:wp="http://schemas.openxmlformats.org/drawingml/2006/wordprocessingDrawing" xmlns:w10="urn:schemas-microsoft-com:office:word" xmlns:w="http://schemas.openxmlformats.org/wordprocessingml/2006/main" xmlns:w14="http://schemas.microsoft.com/office/word/2010/wordml" xmlns:w15="http://schemas.microsoft.com/office/word/2012/wordml" xmlns:w16cex="http://schemas.microsoft.com/office/word/2018/wordml/cex" xmlns:w16cid="http://schemas.microsoft.com/office/word/2016/wordml/cid" xmlns:w16="http://schemas.microsoft.com/office/word/2018/wordml" xmlns:w16du="http://schemas.microsoft.com/office/word/2023/wordml/word16du" xmlns:w16sdtdh="http://schemas.microsoft.com/office/word/2020/wordml/sdtdatahash" xmlns:w16sdtfl="http://schemas.microsoft.com/office/word/2024/wordml/sdtformatlock" xmlns:w16se="http://schemas.microsoft.com/office/word/2015/wordml/symex" xmlns:wpg="http://schemas.microsoft.com/office/word/2010/wordprocessingGroup" xmlns:wpi="http://schemas.microsoft.com/office/word/2010/wordprocessingInk" xmlns:wne="http://schemas.microsoft.com/office/word/2006/wordml" xmlns:wps="http://schemas.microsoft.com/office/word/2010/wordprocessingShape" mc:Ignorable="w14 w15 w16se w16cid w16 w16cex w16sdtdh w16sdtfl w16du wp14">
+  <w:abstractNum w:abstractNumId="0" w15:restartNumberingAfterBreak="0">
+    <w:nsid w:val="030620E9"/>
+    <w:multiLevelType w:val="hybridMultilevel"/>
+    <w:tmpl w:val="75E407EC"/>
+    <w:lvl w:ilvl="0" w:tplc="0809000F">
+      <w:start w:val="1"/>
+      <w:numFmt w:val="decimal"/>
+      <w:lvlText w:val="%1."/>
+      <w:lvlJc w:val="left"/>
+      <w:pPr>
+        <w:ind w:left="720" w:hanging="360"/>
+      </w:pPr>
+    </w:lvl>
+    <w:lvl w:ilvl="1" w:tplc="08090019" w:tentative="1">
+      <w:start w:val="1"/>
+      <w:numFmt w:val="lowerLetter"/>
+      <w:lvlText w:val="%2."/>
+      <w:lvlJc w:val="left"/>
+      <w:pPr>
+        <w:ind w:left="1440" w:hanging="360"/>
+      </w:pPr>
+    </w:lvl>
+    <w:lvl w:ilvl="2" w:tplc="0809001B" w:tentative="1">
+      <w:start w:val="1"/>
+      <w:numFmt w:val="lowerRoman"/>
+      <w:lvlText w:val="%3."/>
+      <w:lvlJc w:val="right"/>
+      <w:pPr>
+        <w:ind w:left="2160" w:hanging="180"/>
+      </w:pPr>
+    </w:lvl>
+    <w:lvl w:ilvl="3" w:tplc="0809000F" w:tentative="1">
+      <w:start w:val="1"/>
+      <w:numFmt w:val="decimal"/>
+      <w:lvlText w:val="%4."/>
+      <w:lvlJc w:val="left"/>
+      <w:pPr>
+        <w:ind w:left="2880" w:hanging="360"/>
+      </w:pPr>
+    </w:lvl>
+    <w:lvl w:ilvl="4" w:tplc="08090019" w:tentative="1">
+      <w:start w:val="1"/>
+      <w:numFmt w:val="lowerLetter"/>
+      <w:lvlText w:val="%5."/>
+      <w:lvlJc w:val="left"/>
+      <w:pPr>
+        <w:ind w:left="3600" w:hanging="360"/>
+      </w:pPr>
+    </w:lvl>
+    <w:lvl w:ilvl="5" w:tplc="0809001B" w:tentative="1">
+      <w:start w:val="1"/>
+      <w:numFmt w:val="lowerRoman"/>
+      <w:lvlText w:val="%6."/>
+      <w:lvlJc w:val="right"/>
+      <w:pPr>
+        <w:ind w:left="4320" w:hanging="180"/>
+      </w:pPr>
+    </w:lvl>
+    <w:lvl w:ilvl="6" w:tplc="0809000F" w:tentative="1">
+      <w:start w:val="1"/>
+      <w:numFmt w:val="decimal"/>
+      <w:lvlText w:val="%7."/>
+      <w:lvlJc w:val="left"/>
+      <w:pPr>
+        <w:ind w:left="5040" w:hanging="360"/>
+      </w:pPr>
+    </w:lvl>
+    <w:lvl w:ilvl="7" w:tplc="08090019" w:tentative="1">
+      <w:start w:val="1"/>
+      <w:numFmt w:val="lowerLetter"/>
+      <w:lvlText w:val="%8."/>
+      <w:lvlJc w:val="left"/>
+      <w:pPr>
+        <w:ind w:left="5760" w:hanging="360"/>
+      </w:pPr>
+    </w:lvl>
+    <w:lvl w:ilvl="8" w:tplc="0809001B" w:tentative="1">
+      <w:start w:val="1"/>
+      <w:numFmt w:val="lowerRoman"/>
+      <w:lvlText w:val="%9."/>
+      <w:lvlJc w:val="right"/>
+      <w:pPr>
+        <w:ind w:left="6480" w:hanging="180"/>
+      </w:pPr>
+    </w:lvl>
+  </w:abstractNum>
+  <w:abstractNum w:abstractNumId="1" w15:restartNumberingAfterBreak="0">
+    <w:nsid w:val="366D3312"/>
+    <w:multiLevelType w:val="hybridMultilevel"/>
+    <w:tmpl w:val="0DC824B4"/>
+    <w:lvl w:ilvl="0" w:tplc="0809000F">
+      <w:start w:val="1"/>
+      <w:numFmt w:val="decimal"/>
+      <w:lvlText w:val="%1."/>
+      <w:lvlJc w:val="left"/>
+      <w:pPr>
+        <w:ind w:left="720" w:hanging="360"/>
+      </w:pPr>
+    </w:lvl>
+    <w:lvl w:ilvl="1" w:tplc="08090019" w:tentative="1">
+      <w:start w:val="1"/>
+      <w:numFmt w:val="lowerLetter"/>
+      <w:lvlText w:val="%2."/>
+      <w:lvlJc w:val="left"/>
+      <w:pPr>
+        <w:ind w:left="1440" w:hanging="360"/>
+      </w:pPr>
+    </w:lvl>
+    <w:lvl w:ilvl="2" w:tplc="0809001B" w:tentative="1">
+      <w:start w:val="1"/>
+      <w:numFmt w:val="lowerRoman"/>
+      <w:lvlText w:val="%3."/>
+      <w:lvlJc w:val="right"/>
+      <w:pPr>
+        <w:ind w:left="2160" w:hanging="180"/>
+      </w:pPr>
+    </w:lvl>
+    <w:lvl w:ilvl="3" w:tplc="0809000F" w:tentative="1">
+      <w:start w:val="1"/>
+      <w:numFmt w:val="decimal"/>
+      <w:lvlText w:val="%4."/>
+      <w:lvlJc w:val="left"/>
+      <w:pPr>
+        <w:ind w:left="2880" w:hanging="360"/>
+      </w:pPr>
+    </w:lvl>
+    <w:lvl w:ilvl="4" w:tplc="08090019" w:tentative="1">
+      <w:start w:val="1"/>
+      <w:numFmt w:val="lowerLetter"/>
+      <w:lvlText w:val="%5."/>
+      <w:lvlJc w:val="left"/>
+      <w:pPr>
+        <w:ind w:left="3600" w:hanging="360"/>
+      </w:pPr>
+    </w:lvl>
+    <w:lvl w:ilvl="5" w:tplc="0809001B" w:tentative="1">
+      <w:start w:val="1"/>
+      <w:numFmt w:val="lowerRoman"/>
+      <w:lvlText w:val="%6."/>
+      <w:lvlJc w:val="right"/>
+      <w:pPr>
+        <w:ind w:left="4320" w:hanging="180"/>
+      </w:pPr>
+    </w:lvl>
+    <w:lvl w:ilvl="6" w:tplc="0809000F" w:tentative="1">
+      <w:start w:val="1"/>
+      <w:numFmt w:val="decimal"/>
+      <w:lvlText w:val="%7."/>
+      <w:lvlJc w:val="left"/>
+      <w:pPr>
+        <w:ind w:left="5040" w:hanging="360"/>
+      </w:pPr>
+    </w:lvl>
+    <w:lvl w:ilvl="7" w:tplc="08090019" w:tentative="1">
+      <w:start w:val="1"/>
+      <w:numFmt w:val="lowerLetter"/>
+      <w:lvlText w:val="%8."/>
+      <w:lvlJc w:val="left"/>
+      <w:pPr>
+        <w:ind w:left="5760" w:hanging="360"/>
+      </w:pPr>
+    </w:lvl>
+    <w:lvl w:ilvl="8" w:tplc="0809001B" w:tentative="1">
+      <w:start w:val="1"/>
+      <w:numFmt w:val="lowerRoman"/>
+      <w:lvlText w:val="%9."/>
+      <w:lvlJc w:val="right"/>
+      <w:pPr>
+        <w:ind w:left="6480" w:hanging="180"/>
+      </w:pPr>
+    </w:lvl>
+  </w:abstractNum>
+  <w:abstractNum w:abstractNumId="2" w15:restartNumberingAfterBreak="0">
+    <w:nsid w:val="3ED23D7F"/>
+    <w:multiLevelType w:val="hybridMultilevel"/>
+    <w:tmpl w:val="08B8E2A6"/>
+    <w:lvl w:ilvl="0" w:tplc="0809000F">
+      <w:start w:val="1"/>
+      <w:numFmt w:val="decimal"/>
+      <w:lvlText w:val="%1."/>
+      <w:lvlJc w:val="left"/>
+      <w:pPr>
+        <w:ind w:left="720" w:hanging="360"/>
+      </w:pPr>
+    </w:lvl>
+    <w:lvl w:ilvl="1" w:tplc="08090019" w:tentative="1">
+      <w:start w:val="1"/>
+      <w:numFmt w:val="lowerLetter"/>
+      <w:lvlText w:val="%2."/>
+      <w:lvlJc w:val="left"/>
+      <w:pPr>
+        <w:ind w:left="1440" w:hanging="360"/>
+      </w:pPr>
+    </w:lvl>
+    <w:lvl w:ilvl="2" w:tplc="0809001B" w:tentative="1">
+      <w:start w:val="1"/>
+      <w:numFmt w:val="lowerRoman"/>
+      <w:lvlText w:val="%3."/>
+      <w:lvlJc w:val="right"/>
+      <w:pPr>
+        <w:ind w:left="2160" w:hanging="180"/>
+      </w:pPr>
+    </w:lvl>
+    <w:lvl w:ilvl="3" w:tplc="0809000F" w:tentative="1">
+      <w:start w:val="1"/>
+      <w:numFmt w:val="decimal"/>
+      <w:lvlText w:val="%4."/>
+      <w:lvlJc w:val="left"/>
+      <w:pPr>
+        <w:ind w:left="2880" w:hanging="360"/>
+      </w:pPr>
+    </w:lvl>
+    <w:lvl w:ilvl="4" w:tplc="08090019" w:tentative="1">
+      <w:start w:val="1"/>
+      <w:numFmt w:val="lowerLetter"/>
+      <w:lvlText w:val="%5."/>
+      <w:lvlJc w:val="left"/>
+      <w:pPr>
+        <w:ind w:left="3600" w:hanging="360"/>
+      </w:pPr>
+    </w:lvl>
+    <w:lvl w:ilvl="5" w:tplc="0809001B" w:tentative="1">
+      <w:start w:val="1"/>
+      <w:numFmt w:val="lowerRoman"/>
+      <w:lvlText w:val="%6."/>
+      <w:lvlJc w:val="right"/>
+      <w:pPr>
+        <w:ind w:left="4320" w:hanging="180"/>
+      </w:pPr>
+    </w:lvl>
+    <w:lvl w:ilvl="6" w:tplc="0809000F" w:tentative="1">
+      <w:start w:val="1"/>
+      <w:numFmt w:val="decimal"/>
+      <w:lvlText w:val="%7."/>
+      <w:lvlJc w:val="left"/>
+      <w:pPr>
+        <w:ind w:left="5040" w:hanging="360"/>
+      </w:pPr>
+    </w:lvl>
+    <w:lvl w:ilvl="7" w:tplc="08090019" w:tentative="1">
+      <w:start w:val="1"/>
+      <w:numFmt w:val="lowerLetter"/>
+      <w:lvlText w:val="%8."/>
+      <w:lvlJc w:val="left"/>
+      <w:pPr>
+        <w:ind w:left="5760" w:hanging="360"/>
+      </w:pPr>
+    </w:lvl>
+    <w:lvl w:ilvl="8" w:tplc="0809001B" w:tentative="1">
+      <w:start w:val="1"/>
+      <w:numFmt w:val="lowerRoman"/>
+      <w:lvlText w:val="%9."/>
+      <w:lvlJc w:val="right"/>
+      <w:pPr>
+        <w:ind w:left="6480" w:hanging="180"/>
+      </w:pPr>
+    </w:lvl>
+  </w:abstractNum>
+  <w:num w:numId="1" w16cid:durableId="1188910206">
+    <w:abstractNumId w:val="2"/>
+  </w:num>
+  <w:num w:numId="2" w16cid:durableId="590818871">
+    <w:abstractNumId w:val="1"/>
+  </w:num>
+  <w:num w:numId="3" w16cid:durableId="1073314130">
+    <w:abstractNumId w:val="0"/>
+  </w:num>
+</w:numbering>
 </file>
 
 <file path=word/styles.xml><?xml version="1.0" encoding="utf-8"?>
@@ -701,7 +1510,6 @@
   <w:style w:type="character" w:default="1" w:styleId="DefaultParagraphFont">
     <w:name w:val="Default Paragraph Font"/>
     <w:uiPriority w:val="1"/>
-    <w:semiHidden/>
     <w:unhideWhenUsed/>
   </w:style>
   <w:style w:type="table" w:default="1" w:styleId="TableNormal">
@@ -1058,6 +1866,25 @@
     <w:link w:val="Footer"/>
     <w:uiPriority w:val="99"/>
     <w:rsid w:val="00CA5F54"/>
+  </w:style>
+  <w:style w:type="table" w:styleId="TableGrid">
+    <w:name w:val="Table Grid"/>
+    <w:basedOn w:val="TableNormal"/>
+    <w:uiPriority w:val="39"/>
+    <w:rsid w:val="004D7C24"/>
+    <w:pPr>
+      <w:spacing w:after="0" w:line="240" w:lineRule="auto"/>
+    </w:pPr>
+    <w:tblPr>
+      <w:tblBorders>
+        <w:top w:val="single" w:sz="4" w:space="0" w:color="auto"/>
+        <w:left w:val="single" w:sz="4" w:space="0" w:color="auto"/>
+        <w:bottom w:val="single" w:sz="4" w:space="0" w:color="auto"/>
+        <w:right w:val="single" w:sz="4" w:space="0" w:color="auto"/>
+        <w:insideH w:val="single" w:sz="4" w:space="0" w:color="auto"/>
+        <w:insideV w:val="single" w:sz="4" w:space="0" w:color="auto"/>
+      </w:tblBorders>
+    </w:tblPr>
   </w:style>
 </w:styles>
 </file>

</xml_diff>

<commit_message>
docs: alter use case
reflects time can affect promotion run time
</commit_message>
<xml_diff>
--- a/Documentation/Use_Case_Specification.docx
+++ b/Documentation/Use_Case_Specification.docx
@@ -4,584 +4,776 @@
   <w:body>
     <w:tbl>
       <w:tblPr>
-        <w:tblStyle w:val="TableGrid"/>
-        <w:tblW w:w="0" w:type="auto"/>
-        <w:tblLook w:val="04A0" w:firstRow="1" w:lastRow="0" w:firstColumn="1" w:lastColumn="0" w:noHBand="0" w:noVBand="1"/>
+        <w:tblW w:w="10007" w:type="dxa"/>
+        <w:tblInd w:w="55" w:type="dxa"/>
+        <w:tblLayout w:type="fixed"/>
+        <w:tblCellMar>
+          <w:top w:w="55" w:type="dxa"/>
+          <w:left w:w="55" w:type="dxa"/>
+          <w:bottom w:w="55" w:type="dxa"/>
+          <w:right w:w="55" w:type="dxa"/>
+        </w:tblCellMar>
+        <w:tblLook w:val="0000" w:firstRow="0" w:lastRow="0" w:firstColumn="0" w:lastColumn="0" w:noHBand="0" w:noVBand="0"/>
       </w:tblPr>
       <w:tblGrid>
-        <w:gridCol w:w="4508"/>
-        <w:gridCol w:w="4508"/>
+        <w:gridCol w:w="4684"/>
+        <w:gridCol w:w="5323"/>
       </w:tblGrid>
       <w:tr>
+        <w:trPr>
+          <w:trHeight w:val="291"/>
+        </w:trPr>
         <w:tc>
           <w:tcPr>
-            <w:tcW w:w="4508" w:type="dxa"/>
+            <w:tcW w:w="4684" w:type="dxa"/>
+            <w:tcBorders>
+              <w:top w:val="single" w:sz="1" w:space="0" w:color="000000"/>
+              <w:left w:val="single" w:sz="1" w:space="0" w:color="000000"/>
+              <w:bottom w:val="single" w:sz="1" w:space="0" w:color="000000"/>
+              <w:right w:val="single" w:sz="1" w:space="0" w:color="000000"/>
+            </w:tcBorders>
           </w:tcPr>
           <w:p>
-            <w:r>
-              <w:rPr>
+            <w:pPr>
+              <w:spacing w:after="0"/>
+              <w:rPr>
+                <w:rFonts w:asciiTheme="majorBidi" w:hAnsiTheme="majorBidi" w:cstheme="majorBidi"/>
+                <w:sz w:val="22"/>
+                <w:szCs w:val="22"/>
+              </w:rPr>
+            </w:pPr>
+            <w:r>
+              <w:rPr>
+                <w:rFonts w:asciiTheme="majorBidi" w:hAnsiTheme="majorBidi" w:cstheme="majorBidi"/>
                 <w:b/>
                 <w:bCs/>
-              </w:rPr>
-              <w:t xml:space="preserve">Use Case ID: </w:t>
+                <w:sz w:val="22"/>
+                <w:szCs w:val="22"/>
+              </w:rPr>
+              <w:t>Use case ID:</w:t>
+            </w:r>
+            <w:r>
+              <w:rPr>
+                <w:rFonts w:asciiTheme="majorBidi" w:hAnsiTheme="majorBidi" w:cstheme="majorBidi"/>
+                <w:sz w:val="22"/>
+                <w:szCs w:val="22"/>
+              </w:rPr>
+              <w:t xml:space="preserve"> </w:t>
+            </w:r>
+            <w:r>
+              <w:rPr>
+                <w:rFonts w:asciiTheme="majorBidi" w:hAnsiTheme="majorBidi" w:cstheme="majorBidi"/>
+                <w:sz w:val="22"/>
+                <w:szCs w:val="22"/>
+              </w:rPr>
+              <w:t>0</w:t>
+            </w:r>
+            <w:r>
+              <w:rPr>
+                <w:rFonts w:asciiTheme="majorBidi" w:hAnsiTheme="majorBidi" w:cstheme="majorBidi"/>
+                <w:color w:val="000000"/>
+                <w:sz w:val="22"/>
+                <w:szCs w:val="22"/>
+              </w:rPr>
+              <w:t>1</w:t>
             </w:r>
           </w:p>
         </w:tc>
         <w:tc>
           <w:tcPr>
-            <w:tcW w:w="4508" w:type="dxa"/>
+            <w:tcW w:w="5323" w:type="dxa"/>
+            <w:tcBorders>
+              <w:top w:val="single" w:sz="1" w:space="0" w:color="000000"/>
+              <w:left w:val="single" w:sz="1" w:space="0" w:color="000000"/>
+              <w:bottom w:val="single" w:sz="1" w:space="0" w:color="000000"/>
+              <w:right w:val="single" w:sz="1" w:space="0" w:color="000000"/>
+            </w:tcBorders>
           </w:tcPr>
           <w:p>
-            <w:r>
-              <w:rPr>
+            <w:pPr>
+              <w:spacing w:after="0"/>
+              <w:rPr>
+                <w:rFonts w:asciiTheme="majorBidi" w:hAnsiTheme="majorBidi" w:cstheme="majorBidi"/>
+                <w:sz w:val="22"/>
+                <w:szCs w:val="22"/>
+              </w:rPr>
+            </w:pPr>
+            <w:r>
+              <w:rPr>
+                <w:rFonts w:asciiTheme="majorBidi" w:hAnsiTheme="majorBidi" w:cstheme="majorBidi"/>
                 <w:b/>
                 <w:bCs/>
-              </w:rPr>
-              <w:t xml:space="preserve">Use Case: </w:t>
-            </w:r>
-            <w:r>
-              <w:t>Template</w:t>
+                <w:sz w:val="22"/>
+                <w:szCs w:val="22"/>
+              </w:rPr>
+              <w:t>Use case:</w:t>
+            </w:r>
+            <w:r>
+              <w:rPr>
+                <w:rFonts w:asciiTheme="majorBidi" w:hAnsiTheme="majorBidi" w:cstheme="majorBidi"/>
+                <w:sz w:val="22"/>
+                <w:szCs w:val="22"/>
+              </w:rPr>
+              <w:t xml:space="preserve"> </w:t>
+            </w:r>
+            <w:r>
+              <w:rPr>
+                <w:rFonts w:asciiTheme="majorBidi" w:hAnsiTheme="majorBidi" w:cstheme="majorBidi"/>
+                <w:sz w:val="22"/>
+                <w:szCs w:val="22"/>
+              </w:rPr>
+              <w:t>Register</w:t>
             </w:r>
           </w:p>
         </w:tc>
       </w:tr>
       <w:tr>
+        <w:trPr>
+          <w:trHeight w:val="585"/>
+        </w:trPr>
         <w:tc>
           <w:tcPr>
-            <w:tcW w:w="9016" w:type="dxa"/>
+            <w:tcW w:w="10007" w:type="dxa"/>
             <w:gridSpan w:val="2"/>
+            <w:tcBorders>
+              <w:left w:val="single" w:sz="1" w:space="0" w:color="000000"/>
+              <w:bottom w:val="single" w:sz="1" w:space="0" w:color="000000"/>
+              <w:right w:val="single" w:sz="1" w:space="0" w:color="000000"/>
+            </w:tcBorders>
           </w:tcPr>
           <w:p>
             <w:pPr>
-              <w:rPr>
+              <w:spacing w:after="0"/>
+              <w:jc w:val="both"/>
+              <w:rPr>
+                <w:rFonts w:asciiTheme="majorBidi" w:hAnsiTheme="majorBidi" w:cstheme="majorBidi"/>
+                <w:sz w:val="22"/>
+                <w:szCs w:val="22"/>
+              </w:rPr>
+            </w:pPr>
+            <w:r>
+              <w:rPr>
+                <w:rFonts w:asciiTheme="majorBidi" w:hAnsiTheme="majorBidi" w:cstheme="majorBidi"/>
                 <w:b/>
                 <w:bCs/>
-              </w:rPr>
-            </w:pPr>
-            <w:r>
-              <w:rPr>
-                <w:b/>
-                <w:bCs/>
-              </w:rPr>
-              <w:t xml:space="preserve">Brief Description: </w:t>
+                <w:sz w:val="22"/>
+                <w:szCs w:val="22"/>
+              </w:rPr>
+              <w:t>Brief Description:</w:t>
+            </w:r>
+            <w:r>
+              <w:rPr>
+                <w:rFonts w:asciiTheme="majorBidi" w:hAnsiTheme="majorBidi" w:cstheme="majorBidi"/>
+                <w:sz w:val="22"/>
+                <w:szCs w:val="22"/>
+              </w:rPr>
+              <w:t xml:space="preserve"> </w:t>
+            </w:r>
+            <w:r>
+              <w:rPr>
+                <w:rFonts w:ascii="Times New Roman" w:hAnsi="Times New Roman" w:cs="Times New Roman"/>
+                <w:sz w:val="22"/>
+                <w:szCs w:val="22"/>
+              </w:rPr>
+              <w:t>This use case defines how a user can register themselves as either a “commercial” or “non-commercial” customer. Successful registration permits the customer to login using their registered email and a randomly generated password.</w:t>
             </w:r>
           </w:p>
         </w:tc>
       </w:tr>
       <w:tr>
+        <w:trPr>
+          <w:trHeight w:val="291"/>
+        </w:trPr>
         <w:tc>
           <w:tcPr>
-            <w:tcW w:w="9016" w:type="dxa"/>
+            <w:tcW w:w="10007" w:type="dxa"/>
             <w:gridSpan w:val="2"/>
+            <w:tcBorders>
+              <w:left w:val="single" w:sz="1" w:space="0" w:color="000000"/>
+              <w:bottom w:val="single" w:sz="1" w:space="0" w:color="000000"/>
+              <w:right w:val="single" w:sz="1" w:space="0" w:color="000000"/>
+            </w:tcBorders>
           </w:tcPr>
           <w:p>
             <w:pPr>
-              <w:rPr>
+              <w:spacing w:after="0"/>
+              <w:rPr>
+                <w:rFonts w:asciiTheme="majorBidi" w:hAnsiTheme="majorBidi" w:cstheme="majorBidi"/>
                 <w:b/>
                 <w:bCs/>
-              </w:rPr>
-            </w:pPr>
-            <w:r>
-              <w:rPr>
+                <w:sz w:val="22"/>
+                <w:szCs w:val="22"/>
+              </w:rPr>
+            </w:pPr>
+            <w:r>
+              <w:rPr>
+                <w:rFonts w:asciiTheme="majorBidi" w:hAnsiTheme="majorBidi" w:cstheme="majorBidi"/>
                 <w:b/>
                 <w:bCs/>
-              </w:rPr>
-              <w:t xml:space="preserve">Primary Actors: </w:t>
+                <w:sz w:val="22"/>
+                <w:szCs w:val="22"/>
+              </w:rPr>
+              <w:t>Primary actors:</w:t>
+            </w:r>
+            <w:r>
+              <w:rPr>
+                <w:rFonts w:asciiTheme="majorBidi" w:hAnsiTheme="majorBidi" w:cstheme="majorBidi"/>
+                <w:sz w:val="22"/>
+                <w:szCs w:val="22"/>
+              </w:rPr>
+              <w:t xml:space="preserve"> </w:t>
+            </w:r>
+            <w:r>
+              <w:rPr>
+                <w:rFonts w:ascii="Times New Roman" w:hAnsi="Times New Roman" w:cs="Times New Roman"/>
+                <w:sz w:val="22"/>
+                <w:szCs w:val="22"/>
+              </w:rPr>
+              <w:t>Customer</w:t>
             </w:r>
           </w:p>
         </w:tc>
       </w:tr>
       <w:tr>
+        <w:trPr>
+          <w:trHeight w:val="291"/>
+        </w:trPr>
         <w:tc>
           <w:tcPr>
-            <w:tcW w:w="9016" w:type="dxa"/>
+            <w:tcW w:w="10007" w:type="dxa"/>
             <w:gridSpan w:val="2"/>
+            <w:tcBorders>
+              <w:left w:val="single" w:sz="1" w:space="0" w:color="000000"/>
+              <w:bottom w:val="single" w:sz="1" w:space="0" w:color="000000"/>
+              <w:right w:val="single" w:sz="1" w:space="0" w:color="000000"/>
+            </w:tcBorders>
           </w:tcPr>
           <w:p>
             <w:pPr>
-              <w:rPr>
+              <w:spacing w:after="0"/>
+              <w:rPr>
+                <w:rFonts w:asciiTheme="majorBidi" w:hAnsiTheme="majorBidi" w:cstheme="majorBidi"/>
+                <w:sz w:val="22"/>
+                <w:szCs w:val="22"/>
+              </w:rPr>
+            </w:pPr>
+            <w:r>
+              <w:rPr>
+                <w:rFonts w:asciiTheme="majorBidi" w:hAnsiTheme="majorBidi" w:cstheme="majorBidi"/>
                 <w:b/>
                 <w:bCs/>
-              </w:rPr>
-            </w:pPr>
-            <w:r>
-              <w:rPr>
-                <w:b/>
-                <w:bCs/>
-              </w:rPr>
-              <w:t xml:space="preserve">Secondary Actors: </w:t>
+                <w:sz w:val="22"/>
+                <w:szCs w:val="22"/>
+              </w:rPr>
+              <w:t>Secondary actors:</w:t>
+            </w:r>
+            <w:r>
+              <w:rPr>
+                <w:rFonts w:asciiTheme="majorBidi" w:hAnsiTheme="majorBidi" w:cstheme="majorBidi"/>
+                <w:sz w:val="22"/>
+                <w:szCs w:val="22"/>
+              </w:rPr>
+              <w:t xml:space="preserve"> </w:t>
+            </w:r>
+            <w:r>
+              <w:rPr>
+                <w:rFonts w:asciiTheme="majorBidi" w:hAnsiTheme="majorBidi" w:cstheme="majorBidi"/>
+                <w:sz w:val="22"/>
+                <w:szCs w:val="22"/>
+              </w:rPr>
+              <w:t>None</w:t>
+            </w:r>
+            <w:r>
+              <w:rPr>
+                <w:rFonts w:asciiTheme="majorBidi" w:hAnsiTheme="majorBidi" w:cstheme="majorBidi"/>
+                <w:sz w:val="22"/>
+                <w:szCs w:val="22"/>
+              </w:rPr>
+              <w:t xml:space="preserve"> </w:t>
             </w:r>
           </w:p>
         </w:tc>
       </w:tr>
       <w:tr>
+        <w:trPr>
+          <w:trHeight w:val="830"/>
+        </w:trPr>
         <w:tc>
           <w:tcPr>
-            <w:tcW w:w="9016" w:type="dxa"/>
+            <w:tcW w:w="10007" w:type="dxa"/>
             <w:gridSpan w:val="2"/>
+            <w:tcBorders>
+              <w:left w:val="single" w:sz="1" w:space="0" w:color="000000"/>
+              <w:bottom w:val="single" w:sz="1" w:space="0" w:color="000000"/>
+              <w:right w:val="single" w:sz="1" w:space="0" w:color="000000"/>
+            </w:tcBorders>
           </w:tcPr>
           <w:p>
             <w:pPr>
-              <w:rPr>
+              <w:spacing w:after="0"/>
+              <w:rPr>
+                <w:rFonts w:asciiTheme="majorBidi" w:hAnsiTheme="majorBidi" w:cstheme="majorBidi"/>
                 <w:b/>
                 <w:bCs/>
-              </w:rPr>
-            </w:pPr>
-            <w:r>
-              <w:rPr>
+                <w:sz w:val="22"/>
+                <w:szCs w:val="22"/>
+              </w:rPr>
+            </w:pPr>
+            <w:r>
+              <w:rPr>
+                <w:rFonts w:asciiTheme="majorBidi" w:hAnsiTheme="majorBidi" w:cstheme="majorBidi"/>
                 <w:b/>
                 <w:bCs/>
-              </w:rPr>
-              <w:t xml:space="preserve">Preconditions: </w:t>
+                <w:sz w:val="22"/>
+                <w:szCs w:val="22"/>
+              </w:rPr>
+              <w:t>Preconditions:</w:t>
+            </w:r>
+          </w:p>
+          <w:p>
+            <w:pPr>
+              <w:pStyle w:val="ListParagraph"/>
+              <w:numPr>
+                <w:ilvl w:val="0"/>
+                <w:numId w:val="7"/>
+              </w:numPr>
+              <w:rPr>
+                <w:rFonts w:ascii="Times New Roman" w:hAnsi="Times New Roman" w:cs="Times New Roman"/>
+                <w:sz w:val="22"/>
+                <w:szCs w:val="22"/>
+              </w:rPr>
+            </w:pPr>
+            <w:r>
+              <w:rPr>
+                <w:rFonts w:ascii="Times New Roman" w:hAnsi="Times New Roman" w:cs="Times New Roman"/>
+                <w:sz w:val="22"/>
+                <w:szCs w:val="22"/>
+              </w:rPr>
+              <w:t>The system is operational</w:t>
+            </w:r>
+          </w:p>
+          <w:p>
+            <w:pPr>
+              <w:pStyle w:val="ListParagraph"/>
+              <w:numPr>
+                <w:ilvl w:val="0"/>
+                <w:numId w:val="7"/>
+              </w:numPr>
+              <w:rPr>
+                <w:rFonts w:ascii="Times New Roman" w:hAnsi="Times New Roman" w:cs="Times New Roman"/>
+                <w:sz w:val="22"/>
+                <w:szCs w:val="22"/>
+              </w:rPr>
+            </w:pPr>
+            <w:r>
+              <w:rPr>
+                <w:rFonts w:ascii="Times New Roman" w:hAnsi="Times New Roman" w:cs="Times New Roman"/>
+                <w:sz w:val="22"/>
+                <w:szCs w:val="22"/>
+              </w:rPr>
+              <w:t>A commercial customer must register with the following details: company registration number, company directors, type of business, address, email address, etc.</w:t>
+            </w:r>
+          </w:p>
+          <w:p>
+            <w:pPr>
+              <w:pStyle w:val="ListParagraph"/>
+              <w:numPr>
+                <w:ilvl w:val="0"/>
+                <w:numId w:val="7"/>
+              </w:numPr>
+              <w:spacing w:after="0" w:line="240" w:lineRule="auto"/>
+              <w:rPr>
+                <w:rFonts w:asciiTheme="majorBidi" w:hAnsiTheme="majorBidi" w:cstheme="majorBidi"/>
+                <w:sz w:val="22"/>
+                <w:szCs w:val="22"/>
+              </w:rPr>
+            </w:pPr>
+            <w:r>
+              <w:rPr>
+                <w:rFonts w:ascii="Times New Roman" w:hAnsi="Times New Roman" w:cs="Times New Roman"/>
+                <w:sz w:val="22"/>
+                <w:szCs w:val="22"/>
+              </w:rPr>
+              <w:t>A non-commercial customer requires a valid email address.</w:t>
             </w:r>
           </w:p>
         </w:tc>
       </w:tr>
       <w:tr>
+        <w:trPr>
+          <w:trHeight w:val="383"/>
+        </w:trPr>
         <w:tc>
           <w:tcPr>
-            <w:tcW w:w="9016" w:type="dxa"/>
+            <w:tcW w:w="10007" w:type="dxa"/>
             <w:gridSpan w:val="2"/>
+            <w:tcBorders>
+              <w:left w:val="single" w:sz="1" w:space="0" w:color="000000"/>
+              <w:bottom w:val="single" w:sz="1" w:space="0" w:color="000000"/>
+              <w:right w:val="single" w:sz="1" w:space="0" w:color="000000"/>
+            </w:tcBorders>
           </w:tcPr>
           <w:p>
             <w:pPr>
-              <w:rPr>
+              <w:spacing w:after="0"/>
+              <w:rPr>
+                <w:rFonts w:asciiTheme="majorBidi" w:hAnsiTheme="majorBidi" w:cstheme="majorBidi"/>
                 <w:b/>
                 <w:bCs/>
-              </w:rPr>
-            </w:pPr>
-            <w:r>
-              <w:rPr>
+                <w:sz w:val="22"/>
+                <w:szCs w:val="22"/>
+              </w:rPr>
+            </w:pPr>
+            <w:r>
+              <w:rPr>
+                <w:rFonts w:asciiTheme="majorBidi" w:hAnsiTheme="majorBidi" w:cstheme="majorBidi"/>
                 <w:b/>
                 <w:bCs/>
-              </w:rPr>
-              <w:t>Main Flow: Not required</w:t>
+                <w:sz w:val="22"/>
+                <w:szCs w:val="22"/>
+              </w:rPr>
+              <w:t>Main flow: Not required</w:t>
             </w:r>
           </w:p>
         </w:tc>
       </w:tr>
       <w:tr>
+        <w:trPr>
+          <w:trHeight w:val="683"/>
+        </w:trPr>
         <w:tc>
           <w:tcPr>
-            <w:tcW w:w="9016" w:type="dxa"/>
+            <w:tcW w:w="10007" w:type="dxa"/>
             <w:gridSpan w:val="2"/>
+            <w:tcBorders>
+              <w:left w:val="single" w:sz="1" w:space="0" w:color="000000"/>
+              <w:bottom w:val="single" w:sz="1" w:space="0" w:color="000000"/>
+              <w:right w:val="single" w:sz="1" w:space="0" w:color="000000"/>
+            </w:tcBorders>
           </w:tcPr>
           <w:p>
             <w:pPr>
               <w:rPr>
+                <w:rFonts w:asciiTheme="majorBidi" w:hAnsiTheme="majorBidi" w:cstheme="majorBidi"/>
+                <w:sz w:val="22"/>
+                <w:szCs w:val="22"/>
+              </w:rPr>
+            </w:pPr>
+            <w:r>
+              <w:rPr>
+                <w:rFonts w:asciiTheme="majorBidi" w:hAnsiTheme="majorBidi" w:cstheme="majorBidi"/>
                 <w:b/>
                 <w:bCs/>
-              </w:rPr>
-            </w:pPr>
-            <w:r>
-              <w:rPr>
-                <w:b/>
-                <w:bCs/>
-              </w:rPr>
-              <w:t xml:space="preserve">Extensions: </w:t>
-            </w:r>
+                <w:i/>
+                <w:iCs/>
+                <w:sz w:val="22"/>
+                <w:szCs w:val="22"/>
+              </w:rPr>
+              <w:t>Extension use cases</w:t>
+            </w:r>
+            <w:r>
+              <w:rPr>
+                <w:rFonts w:asciiTheme="majorBidi" w:hAnsiTheme="majorBidi" w:cstheme="majorBidi"/>
+                <w:sz w:val="22"/>
+                <w:szCs w:val="22"/>
+              </w:rPr>
+              <w:t xml:space="preserve">: </w:t>
+            </w:r>
+          </w:p>
+          <w:p>
+            <w:pPr>
+              <w:pStyle w:val="ListParagraph"/>
+              <w:numPr>
+                <w:ilvl w:val="0"/>
+                <w:numId w:val="9"/>
+              </w:numPr>
+              <w:rPr>
+                <w:rFonts w:ascii="Times New Roman" w:hAnsi="Times New Roman" w:cs="Times New Roman"/>
+                <w:sz w:val="22"/>
+                <w:szCs w:val="22"/>
+              </w:rPr>
+            </w:pPr>
+            <w:r>
+              <w:rPr>
+                <w:rFonts w:ascii="Times New Roman" w:hAnsi="Times New Roman" w:cs="Times New Roman"/>
+                <w:sz w:val="22"/>
+                <w:szCs w:val="22"/>
+              </w:rPr>
+              <w:t>Validate</w:t>
+            </w:r>
+          </w:p>
+          <w:p>
+            <w:pPr>
+              <w:pStyle w:val="ListParagraph"/>
+              <w:numPr>
+                <w:ilvl w:val="0"/>
+                <w:numId w:val="9"/>
+              </w:numPr>
+              <w:spacing w:after="0" w:line="240" w:lineRule="auto"/>
+              <w:rPr>
+                <w:rFonts w:asciiTheme="majorBidi" w:hAnsiTheme="majorBidi" w:cstheme="majorBidi"/>
+                <w:sz w:val="22"/>
+                <w:szCs w:val="22"/>
+              </w:rPr>
+            </w:pPr>
+            <w:proofErr w:type="spellStart"/>
+            <w:r>
+              <w:rPr>
+                <w:rFonts w:ascii="Times New Roman" w:hAnsi="Times New Roman" w:cs="Times New Roman"/>
+                <w:sz w:val="22"/>
+                <w:szCs w:val="22"/>
+              </w:rPr>
+              <w:t>SMTP</w:t>
+            </w:r>
+            <w:r>
+              <w:rPr>
+                <w:rFonts w:ascii="Times New Roman" w:hAnsi="Times New Roman" w:cs="Times New Roman"/>
+                <w:sz w:val="22"/>
+                <w:szCs w:val="22"/>
+              </w:rPr>
+              <w:t>_</w:t>
+            </w:r>
+            <w:r>
+              <w:rPr>
+                <w:rFonts w:ascii="Times New Roman" w:hAnsi="Times New Roman" w:cs="Times New Roman"/>
+                <w:sz w:val="22"/>
+                <w:szCs w:val="22"/>
+              </w:rPr>
+              <w:t>Notification</w:t>
+            </w:r>
+            <w:proofErr w:type="spellEnd"/>
           </w:p>
         </w:tc>
       </w:tr>
       <w:tr>
+        <w:trPr>
+          <w:trHeight w:val="455"/>
+        </w:trPr>
         <w:tc>
           <w:tcPr>
-            <w:tcW w:w="9016" w:type="dxa"/>
+            <w:tcW w:w="10007" w:type="dxa"/>
             <w:gridSpan w:val="2"/>
+            <w:tcBorders>
+              <w:left w:val="single" w:sz="1" w:space="0" w:color="000000"/>
+              <w:bottom w:val="single" w:sz="1" w:space="0" w:color="000000"/>
+              <w:right w:val="single" w:sz="1" w:space="0" w:color="000000"/>
+            </w:tcBorders>
           </w:tcPr>
           <w:p>
             <w:pPr>
               <w:rPr>
+                <w:rFonts w:asciiTheme="majorBidi" w:hAnsiTheme="majorBidi" w:cstheme="majorBidi"/>
+                <w:sz w:val="22"/>
+                <w:szCs w:val="22"/>
+              </w:rPr>
+            </w:pPr>
+            <w:r>
+              <w:rPr>
+                <w:rFonts w:asciiTheme="majorBidi" w:hAnsiTheme="majorBidi" w:cstheme="majorBidi"/>
                 <w:b/>
                 <w:bCs/>
-              </w:rPr>
-            </w:pPr>
-            <w:r>
-              <w:rPr>
-                <w:b/>
-                <w:bCs/>
-              </w:rPr>
-              <w:t xml:space="preserve">Inclusions: </w:t>
+                <w:i/>
+                <w:iCs/>
+                <w:sz w:val="22"/>
+                <w:szCs w:val="22"/>
+              </w:rPr>
+              <w:t>Inclusion use cases:</w:t>
+            </w:r>
+            <w:r>
+              <w:rPr>
+                <w:rFonts w:asciiTheme="majorBidi" w:hAnsiTheme="majorBidi" w:cstheme="majorBidi"/>
+                <w:sz w:val="22"/>
+                <w:szCs w:val="22"/>
+              </w:rPr>
+              <w:t xml:space="preserve"> None</w:t>
             </w:r>
           </w:p>
         </w:tc>
       </w:tr>
       <w:tr>
+        <w:trPr>
+          <w:trHeight w:val="537"/>
+        </w:trPr>
         <w:tc>
           <w:tcPr>
-            <w:tcW w:w="9016" w:type="dxa"/>
+            <w:tcW w:w="10007" w:type="dxa"/>
             <w:gridSpan w:val="2"/>
+            <w:tcBorders>
+              <w:left w:val="single" w:sz="1" w:space="0" w:color="000000"/>
+              <w:bottom w:val="single" w:sz="1" w:space="0" w:color="000000"/>
+              <w:right w:val="single" w:sz="1" w:space="0" w:color="000000"/>
+            </w:tcBorders>
           </w:tcPr>
           <w:p>
             <w:pPr>
-              <w:rPr>
+              <w:spacing w:after="0"/>
+              <w:rPr>
+                <w:rFonts w:asciiTheme="majorBidi" w:hAnsiTheme="majorBidi" w:cstheme="majorBidi"/>
                 <w:b/>
                 <w:bCs/>
-              </w:rPr>
-            </w:pPr>
-            <w:r>
-              <w:rPr>
+                <w:sz w:val="22"/>
+                <w:szCs w:val="22"/>
+              </w:rPr>
+            </w:pPr>
+            <w:r>
+              <w:rPr>
+                <w:rFonts w:asciiTheme="majorBidi" w:hAnsiTheme="majorBidi" w:cstheme="majorBidi"/>
                 <w:b/>
                 <w:bCs/>
-              </w:rPr>
-              <w:t xml:space="preserve">Postconditions: </w:t>
+                <w:sz w:val="22"/>
+                <w:szCs w:val="22"/>
+              </w:rPr>
+              <w:t>Postconditions:</w:t>
+            </w:r>
+          </w:p>
+          <w:p>
+            <w:pPr>
+              <w:pStyle w:val="ListParagraph"/>
+              <w:numPr>
+                <w:ilvl w:val="0"/>
+                <w:numId w:val="8"/>
+              </w:numPr>
+              <w:rPr>
+                <w:rFonts w:ascii="Times New Roman" w:hAnsi="Times New Roman" w:cs="Times New Roman"/>
+                <w:sz w:val="22"/>
+                <w:szCs w:val="22"/>
+              </w:rPr>
+            </w:pPr>
+            <w:r>
+              <w:rPr>
+                <w:rFonts w:ascii="Times New Roman" w:hAnsi="Times New Roman" w:cs="Times New Roman"/>
+                <w:sz w:val="22"/>
+                <w:szCs w:val="22"/>
+              </w:rPr>
+              <w:t>Customer login account created</w:t>
+            </w:r>
+          </w:p>
+          <w:p>
+            <w:pPr>
+              <w:pStyle w:val="ListParagraph"/>
+              <w:numPr>
+                <w:ilvl w:val="0"/>
+                <w:numId w:val="8"/>
+              </w:numPr>
+              <w:rPr>
+                <w:rFonts w:ascii="Times New Roman" w:hAnsi="Times New Roman" w:cs="Times New Roman"/>
+                <w:sz w:val="22"/>
+                <w:szCs w:val="22"/>
+              </w:rPr>
+            </w:pPr>
+            <w:r>
+              <w:rPr>
+                <w:rFonts w:ascii="Times New Roman" w:hAnsi="Times New Roman" w:cs="Times New Roman"/>
+                <w:sz w:val="22"/>
+                <w:szCs w:val="22"/>
+              </w:rPr>
+              <w:t>A password is generated randomly required for login</w:t>
+            </w:r>
+          </w:p>
+          <w:p>
+            <w:pPr>
+              <w:pStyle w:val="ListParagraph"/>
+              <w:numPr>
+                <w:ilvl w:val="0"/>
+                <w:numId w:val="8"/>
+              </w:numPr>
+              <w:rPr>
+                <w:rFonts w:ascii="Times New Roman" w:hAnsi="Times New Roman" w:cs="Times New Roman"/>
+                <w:sz w:val="22"/>
+                <w:szCs w:val="22"/>
+              </w:rPr>
+            </w:pPr>
+            <w:r>
+              <w:rPr>
+                <w:rFonts w:ascii="Times New Roman" w:hAnsi="Times New Roman" w:cs="Times New Roman"/>
+                <w:sz w:val="22"/>
+                <w:szCs w:val="22"/>
+              </w:rPr>
+              <w:t>Customers are notified by an email in which their login details are included.</w:t>
+            </w:r>
+          </w:p>
+          <w:p>
+            <w:pPr>
+              <w:pStyle w:val="ListParagraph"/>
+              <w:numPr>
+                <w:ilvl w:val="0"/>
+                <w:numId w:val="8"/>
+              </w:numPr>
+              <w:spacing w:after="0" w:line="240" w:lineRule="auto"/>
+              <w:rPr>
+                <w:rFonts w:asciiTheme="majorBidi" w:hAnsiTheme="majorBidi" w:cstheme="majorBidi"/>
+                <w:sz w:val="22"/>
+                <w:szCs w:val="22"/>
+              </w:rPr>
+            </w:pPr>
+            <w:r>
+              <w:rPr>
+                <w:rFonts w:ascii="Times New Roman" w:hAnsi="Times New Roman" w:cs="Times New Roman"/>
+                <w:sz w:val="22"/>
+                <w:szCs w:val="22"/>
+              </w:rPr>
+              <w:t>Customers are required to change the initial password after first login.</w:t>
             </w:r>
           </w:p>
         </w:tc>
       </w:tr>
       <w:tr>
+        <w:trPr>
+          <w:trHeight w:val="585"/>
+        </w:trPr>
         <w:tc>
           <w:tcPr>
-            <w:tcW w:w="9016" w:type="dxa"/>
+            <w:tcW w:w="10007" w:type="dxa"/>
             <w:gridSpan w:val="2"/>
+            <w:tcBorders>
+              <w:left w:val="single" w:sz="1" w:space="0" w:color="000000"/>
+              <w:bottom w:val="single" w:sz="1" w:space="0" w:color="000000"/>
+              <w:right w:val="single" w:sz="1" w:space="0" w:color="000000"/>
+            </w:tcBorders>
           </w:tcPr>
           <w:p>
-            <w:r>
-              <w:rPr>
+            <w:pPr>
+              <w:spacing w:after="0"/>
+              <w:rPr>
+                <w:rFonts w:asciiTheme="majorBidi" w:hAnsiTheme="majorBidi" w:cstheme="majorBidi"/>
                 <w:b/>
                 <w:bCs/>
-              </w:rPr>
-              <w:t xml:space="preserve">Alternative Flows: </w:t>
+                <w:sz w:val="22"/>
+                <w:szCs w:val="22"/>
+              </w:rPr>
+            </w:pPr>
+            <w:r>
+              <w:rPr>
+                <w:rFonts w:asciiTheme="majorBidi" w:hAnsiTheme="majorBidi" w:cstheme="majorBidi"/>
+                <w:b/>
+                <w:bCs/>
+                <w:sz w:val="22"/>
+                <w:szCs w:val="22"/>
+              </w:rPr>
+              <w:t xml:space="preserve">Alternative flows: </w:t>
+            </w:r>
+          </w:p>
+          <w:p>
+            <w:pPr>
+              <w:spacing w:after="0"/>
+              <w:rPr>
+                <w:rFonts w:asciiTheme="majorBidi" w:hAnsiTheme="majorBidi" w:cstheme="majorBidi"/>
+                <w:sz w:val="22"/>
+                <w:szCs w:val="22"/>
+              </w:rPr>
+            </w:pPr>
+            <w:r>
+              <w:rPr>
+                <w:rFonts w:asciiTheme="majorBidi" w:hAnsiTheme="majorBidi" w:cstheme="majorBidi"/>
+                <w:sz w:val="22"/>
+                <w:szCs w:val="22"/>
+              </w:rPr>
+              <w:t>None</w:t>
             </w:r>
           </w:p>
         </w:tc>
       </w:tr>
     </w:tbl>
-    <w:p/>
-    <w:tbl>
-      <w:tblPr>
-        <w:tblStyle w:val="TableGrid"/>
-        <w:tblW w:w="0" w:type="auto"/>
-        <w:tblLook w:val="04A0" w:firstRow="1" w:lastRow="0" w:firstColumn="1" w:lastColumn="0" w:noHBand="0" w:noVBand="1"/>
-      </w:tblPr>
-      <w:tblGrid>
-        <w:gridCol w:w="4508"/>
-        <w:gridCol w:w="4508"/>
-      </w:tblGrid>
-      <w:tr>
-        <w:tc>
-          <w:tcPr>
-            <w:tcW w:w="4508" w:type="dxa"/>
-          </w:tcPr>
-          <w:p>
-            <w:r>
-              <w:rPr>
-                <w:b/>
-                <w:bCs/>
-              </w:rPr>
-              <w:t xml:space="preserve">Use Case ID: </w:t>
-            </w:r>
-            <w:r>
-              <w:t>1</w:t>
-            </w:r>
-          </w:p>
-        </w:tc>
-        <w:tc>
-          <w:tcPr>
-            <w:tcW w:w="4508" w:type="dxa"/>
-          </w:tcPr>
-          <w:p>
-            <w:r>
-              <w:rPr>
-                <w:b/>
-                <w:bCs/>
-              </w:rPr>
-              <w:t xml:space="preserve">Use Case: </w:t>
-            </w:r>
-            <w:r>
-              <w:t>Register</w:t>
-            </w:r>
-          </w:p>
-        </w:tc>
-      </w:tr>
-      <w:tr>
-        <w:tc>
-          <w:tcPr>
-            <w:tcW w:w="9016" w:type="dxa"/>
-            <w:gridSpan w:val="2"/>
-          </w:tcPr>
-          <w:p>
-            <w:r>
-              <w:rPr>
-                <w:b/>
-                <w:bCs/>
-              </w:rPr>
-              <w:t xml:space="preserve">Brief Description: </w:t>
-            </w:r>
-            <w:r>
-              <w:t>This use case defines how a user can register themselves as either a “commercial” or “non-commercial” customer. Successful registration permits the customer to login using their registered email and a randomly generated password.</w:t>
-            </w:r>
-          </w:p>
-        </w:tc>
-      </w:tr>
-      <w:tr>
-        <w:tc>
-          <w:tcPr>
-            <w:tcW w:w="9016" w:type="dxa"/>
-            <w:gridSpan w:val="2"/>
-          </w:tcPr>
-          <w:p>
-            <w:r>
-              <w:rPr>
-                <w:b/>
-                <w:bCs/>
-              </w:rPr>
-              <w:t xml:space="preserve">Primary Actors: </w:t>
-            </w:r>
-            <w:r>
-              <w:t>Customer</w:t>
-            </w:r>
-          </w:p>
-        </w:tc>
-      </w:tr>
-      <w:tr>
-        <w:tc>
-          <w:tcPr>
-            <w:tcW w:w="9016" w:type="dxa"/>
-            <w:gridSpan w:val="2"/>
-          </w:tcPr>
-          <w:p>
-            <w:r>
-              <w:rPr>
-                <w:b/>
-                <w:bCs/>
-              </w:rPr>
-              <w:t xml:space="preserve">Secondary Actors: </w:t>
-            </w:r>
-            <w:r>
-              <w:t>None</w:t>
-            </w:r>
-          </w:p>
-        </w:tc>
-      </w:tr>
-      <w:tr>
-        <w:tc>
-          <w:tcPr>
-            <w:tcW w:w="9016" w:type="dxa"/>
-            <w:gridSpan w:val="2"/>
-          </w:tcPr>
-          <w:p>
-            <w:r>
-              <w:rPr>
-                <w:b/>
-                <w:bCs/>
-              </w:rPr>
-              <w:t xml:space="preserve">Preconditions: </w:t>
-            </w:r>
-          </w:p>
-          <w:p>
-            <w:pPr>
-              <w:pStyle w:val="ListParagraph"/>
-              <w:numPr>
-                <w:ilvl w:val="0"/>
-                <w:numId w:val="1"/>
-              </w:numPr>
-            </w:pPr>
-            <w:r>
-              <w:t>The system is operational</w:t>
-            </w:r>
-          </w:p>
-          <w:p>
-            <w:pPr>
-              <w:pStyle w:val="ListParagraph"/>
-              <w:numPr>
-                <w:ilvl w:val="0"/>
-                <w:numId w:val="1"/>
-              </w:numPr>
-            </w:pPr>
-            <w:r>
-              <w:t>A commercial customer must register with the following details: company registration number, company directors, type of business, address, email address, etc.</w:t>
-            </w:r>
-          </w:p>
-          <w:p>
-            <w:pPr>
-              <w:pStyle w:val="ListParagraph"/>
-              <w:numPr>
-                <w:ilvl w:val="0"/>
-                <w:numId w:val="1"/>
-              </w:numPr>
-            </w:pPr>
-            <w:r>
-              <w:t>A non-commercial customer requires a valid email address.</w:t>
-            </w:r>
-          </w:p>
-        </w:tc>
-      </w:tr>
-      <w:tr>
-        <w:tc>
-          <w:tcPr>
-            <w:tcW w:w="9016" w:type="dxa"/>
-            <w:gridSpan w:val="2"/>
-          </w:tcPr>
-          <w:p>
-            <w:pPr>
-              <w:rPr>
-                <w:b/>
-                <w:bCs/>
-              </w:rPr>
-            </w:pPr>
-            <w:r>
-              <w:rPr>
-                <w:b/>
-                <w:bCs/>
-              </w:rPr>
-              <w:t>Main Flow: Not required</w:t>
-            </w:r>
-          </w:p>
-        </w:tc>
-      </w:tr>
-      <w:tr>
-        <w:tc>
-          <w:tcPr>
-            <w:tcW w:w="9016" w:type="dxa"/>
-            <w:gridSpan w:val="2"/>
-          </w:tcPr>
-          <w:p>
-            <w:r>
-              <w:rPr>
-                <w:b/>
-                <w:bCs/>
-              </w:rPr>
-              <w:t xml:space="preserve">Extensions: </w:t>
-            </w:r>
-          </w:p>
-          <w:p>
-            <w:pPr>
-              <w:pStyle w:val="ListParagraph"/>
-              <w:numPr>
-                <w:ilvl w:val="0"/>
-                <w:numId w:val="2"/>
-              </w:numPr>
-            </w:pPr>
-            <w:r>
-              <w:t>Validate</w:t>
-            </w:r>
-          </w:p>
-          <w:p>
-            <w:pPr>
-              <w:pStyle w:val="ListParagraph"/>
-              <w:numPr>
-                <w:ilvl w:val="0"/>
-                <w:numId w:val="2"/>
-              </w:numPr>
-            </w:pPr>
-            <w:proofErr w:type="spellStart"/>
-            <w:r>
-              <w:t>SMTP_Notification</w:t>
-            </w:r>
-            <w:proofErr w:type="spellEnd"/>
-          </w:p>
-        </w:tc>
-      </w:tr>
-      <w:tr>
-        <w:tc>
-          <w:tcPr>
-            <w:tcW w:w="9016" w:type="dxa"/>
-            <w:gridSpan w:val="2"/>
-          </w:tcPr>
-          <w:p>
-            <w:r>
-              <w:rPr>
-                <w:b/>
-                <w:bCs/>
-              </w:rPr>
-              <w:t xml:space="preserve">Inclusions: </w:t>
-            </w:r>
-            <w:r>
-              <w:t>None</w:t>
-            </w:r>
-          </w:p>
-        </w:tc>
-      </w:tr>
-      <w:tr>
-        <w:tc>
-          <w:tcPr>
-            <w:tcW w:w="9016" w:type="dxa"/>
-            <w:gridSpan w:val="2"/>
-          </w:tcPr>
-          <w:p>
-            <w:r>
-              <w:rPr>
-                <w:b/>
-                <w:bCs/>
-              </w:rPr>
-              <w:t xml:space="preserve">Postconditions: </w:t>
-            </w:r>
-          </w:p>
-          <w:p>
-            <w:pPr>
-              <w:pStyle w:val="ListParagraph"/>
-              <w:numPr>
-                <w:ilvl w:val="0"/>
-                <w:numId w:val="3"/>
-              </w:numPr>
-            </w:pPr>
-            <w:r>
-              <w:t>Customer login account created</w:t>
-            </w:r>
-          </w:p>
-          <w:p>
-            <w:pPr>
-              <w:pStyle w:val="ListParagraph"/>
-              <w:numPr>
-                <w:ilvl w:val="0"/>
-                <w:numId w:val="3"/>
-              </w:numPr>
-            </w:pPr>
-            <w:r>
-              <w:t>A password is generated randomly required for login</w:t>
-            </w:r>
-          </w:p>
-          <w:p>
-            <w:pPr>
-              <w:pStyle w:val="ListParagraph"/>
-              <w:numPr>
-                <w:ilvl w:val="0"/>
-                <w:numId w:val="3"/>
-              </w:numPr>
-            </w:pPr>
-            <w:r>
-              <w:t>Customers are notified by an email in which their login details are included.</w:t>
-            </w:r>
-          </w:p>
-          <w:p>
-            <w:pPr>
-              <w:pStyle w:val="ListParagraph"/>
-              <w:numPr>
-                <w:ilvl w:val="0"/>
-                <w:numId w:val="3"/>
-              </w:numPr>
-            </w:pPr>
-            <w:r>
-              <w:t xml:space="preserve">Customers are required to change the initial password after first login. </w:t>
-            </w:r>
-          </w:p>
-        </w:tc>
-      </w:tr>
-      <w:tr>
-        <w:tc>
-          <w:tcPr>
-            <w:tcW w:w="9016" w:type="dxa"/>
-            <w:gridSpan w:val="2"/>
-          </w:tcPr>
-          <w:p>
-            <w:r>
-              <w:rPr>
-                <w:b/>
-                <w:bCs/>
-              </w:rPr>
-              <w:t xml:space="preserve">Alternative Flows: </w:t>
-            </w:r>
-          </w:p>
-        </w:tc>
-      </w:tr>
-    </w:tbl>
-    <w:p/>
-    <w:p/>
-    <w:p/>
-    <w:p/>
-    <w:p/>
-    <w:p/>
     <w:p/>
     <w:tbl>
       <w:tblPr>
@@ -631,7 +823,6 @@
                 <w:sz w:val="22"/>
                 <w:szCs w:val="22"/>
               </w:rPr>
-              <w:lastRenderedPageBreak/>
               <w:t>Use case ID:</w:t>
             </w:r>
             <w:r>
@@ -1200,6 +1391,7 @@
                 <w:sz w:val="22"/>
                 <w:szCs w:val="22"/>
               </w:rPr>
+              <w:lastRenderedPageBreak/>
               <w:t xml:space="preserve">Alternative flows: </w:t>
             </w:r>
           </w:p>
@@ -1872,6 +2064,7 @@
         </w:tc>
       </w:tr>
     </w:tbl>
+    <w:p/>
     <w:p/>
     <w:sectPr>
       <w:pgSz w:w="11906" w:h="16838"/>

</xml_diff>